<commit_message>
changes made to DMA
</commit_message>
<xml_diff>
--- a/Design_Docs/DMA/GARUDA_DMA_Controller_Design_Spec_v2.0.docx
+++ b/Design_Docs/DMA/GARUDA_DMA_Controller_Design_Spec_v2.0.docx
@@ -23087,7 +23087,7 @@
           <w:sz w:val="20"/>
           <w:szCs w:val="20"/>
         </w:rPr>
-        <w:t xml:space="preserve">CPU is the default AHB master. When the DMA needs the bus: the CPU's current AHB transfer completes first (bus is never yanked mid-transaction), then the DMA gets one beat (one read + one write), then the CPU resumes. With DSRAM banking (4 banks), different-bank accesses proceed in parallel. Same-bank worst case: CPU stalls 1 cycle. Occurs less than 5% of cycles in practice.</w:t>
+        <w:t xml:space="preserve">CPU is the default AHB master. When the DMA needs the bus: the CPU's current AHB transfer completes first (bus is never yanked mid-transaction), then the DMA gets one beat (one read + one write), then the CPU resumes. The Block 6 interconnect grants exactly one master at a time, so CPU and DMA accesses to the Data SRAM are serialised upstream regardless of which banks they target — a different-bank access is serialised exactly as a same-bank access is. DSRAM banking (4 banks) buys lower access energy and a shorter array read, not CPU/DMA concurrency, and the Data SRAM contains no bank arbiter. The CPU's cost of losing an arbitration turn to the DMA is bounded at one beat. (Memory Subsystem Spec Rev 2.0 §7.1/§7.3; AHB Spec §7.3.)</w:t>
       </w:r>
     </w:p>
     <w:p>
@@ -28109,7 +28109,7 @@
                 <w:sz w:val="18"/>
                 <w:szCs w:val="18"/>
               </w:rPr>
-              <w:t xml:space="preserve">CPU and DMA access same DSRAM bank simultaneously</w:t>
+              <w:t xml:space="preserve">CPU and DMA both request the Data SRAM in the same cycle (any bank combination)</w:t>
             </w:r>
           </w:p>
         </w:tc>
@@ -31827,7 +31827,7 @@
                 <w:sz w:val="18"/>
                 <w:szCs w:val="18"/>
               </w:rPr>
-              <w:t xml:space="preserve">DMA writes sensor data here. Bank arbiter resolves DMA-CPU conflicts.</w:t>
+              <w:t xml:space="preserve">DMA writes sensor data here. DMA-CPU contention is resolved by the Block 6 interconnect arbiter, not inside the memory; the Data SRAM has no bank arbiter (Memory Spec Rev 2.0 §7.3).</w:t>
             </w:r>
           </w:p>
         </w:tc>

</xml_diff>